<commit_message>
Rebuild MOM SOPs — remove italic Why: label (template fix retrofit)
Reruns build_mom_sops_v2.py against the already-fixed
sop_record_common.py so MOM's SOP body text drops the "Why:" label
in the same way PSQ/HIC/IMS already do. No content or source
changes — mechanical re-render only. Records regenerated alongside
since the chapter's build script rebuilds everything together.

Co-Authored-By: Claude Sonnet 5 <noreply@anthropic.com>
Claude-Session: https://claude.ai/code/session_016VFLsECWt4VArpBiaqgrgF
</commit_message>
<xml_diff>
--- a/policies/build/sop_record_masters/MOM/SOP_MOM.1.a_to_f_formulary_committee_governance.docx
+++ b/policies/build/sop_record_masters/MOM/SOP_MOM.1.a_to_f_formulary_committee_governance.docx
@@ -208,12 +208,6 @@
     </w:p>
     <w:p>
       <w:r>
-        <w:rPr>
-          <w:i/>
-        </w:rPr>
-        <w:t xml:space="preserve">Why: </w:t>
-      </w:r>
-      <w:r>
         <w:t>so the committee, pharmacy, and every prescriber work from the same formulary and the same governance, not separate private understandings.</w:t>
       </w:r>
     </w:p>
@@ -231,12 +225,6 @@
       </w:r>
     </w:p>
     <w:p>
-      <w:r>
-        <w:rPr>
-          <w:i/>
-        </w:rPr>
-        <w:t xml:space="preserve">Why: </w:t>
-      </w:r>
       <w:r>
         <w:t>a committee that exists on paper but never actually meets, reviews data, or decides anything is not governance -- it is a name on an organisation chart.</w:t>
       </w:r>
@@ -325,12 +313,6 @@
     </w:p>
     <w:p>
       <w:r>
-        <w:rPr>
-          <w:i/>
-        </w:rPr>
-        <w:t xml:space="preserve">Why: </w:t>
-      </w:r>
-      <w:r>
         <w:t>A formulary that was built once and never revisited drifts away from the patients this hospital actually treats -- a drug added to the service list with no formulary entry is a gap a prescriber falls into blind.</w:t>
       </w:r>
     </w:p>
@@ -358,12 +340,6 @@
       </w:r>
     </w:p>
     <w:p>
-      <w:r>
-        <w:rPr>
-          <w:i/>
-        </w:rPr>
-        <w:t xml:space="preserve">Why: </w:t>
-      </w:r>
       <w:r>
         <w:t>A medication decision made alone by whichever doctor is on duty that day, with no one ever reviewing the pattern across patients, is exactly how the same preventable error repeats without anyone connecting the dots.</w:t>
       </w:r>
@@ -393,12 +369,6 @@
     </w:p>
     <w:p>
       <w:r>
-        <w:rPr>
-          <w:i/>
-        </w:rPr>
-        <w:t xml:space="preserve">Why: </w:t>
-      </w:r>
-      <w:r>
         <w:t>A medication bought from an unverified source, or a non-formulary request approved by nobody and written down nowhere, is a decision the hospital cannot later account for if something goes wrong with that batch.</w:t>
       </w:r>
     </w:p>
@@ -421,12 +391,6 @@
       </w:r>
     </w:p>
     <w:p>
-      <w:r>
-        <w:rPr>
-          <w:i/>
-        </w:rPr>
-        <w:t xml:space="preserve">Why: </w:t>
-      </w:r>
       <w:r>
         <w:t>A night-shift patient who needs a medication and finds the pharmacy locked, with no planned alternative, is a gap a nurse is left to improvise around -- improvisation under time pressure is exactly where an error gets made.</w:t>
       </w:r>
@@ -451,12 +415,6 @@
     </w:p>
     <w:p>
       <w:r>
-        <w:rPr>
-          <w:i/>
-        </w:rPr>
-        <w:t xml:space="preserve">Why: </w:t>
-      </w:r>
-      <w:r>
         <w:t>An implant chosen without anyone checking the supplier's licence or the clinical indication is a decision made for the patient with no one actually accountable for it.</w:t>
       </w:r>
     </w:p>
@@ -479,12 +437,6 @@
       </w:r>
     </w:p>
     <w:p>
-      <w:r>
-        <w:rPr>
-          <w:i/>
-        </w:rPr>
-        <w:t xml:space="preserve">Why: </w:t>
-      </w:r>
       <w:r>
         <w:t>A formulary nobody actually prescribes from is a document, not a practice -- the point of agreeing one is that it is the one that gets used.</w:t>
       </w:r>

</xml_diff>